<commit_message>
Überarbeitung Datenschutzerklärung auf Webseite
</commit_message>
<xml_diff>
--- a/HWK-Dateien/Datenschutzerklaerung_DSGVO_rakuhn.docx
+++ b/HWK-Dateien/Datenschutzerklaerung_DSGVO_rakuhn.docx
@@ -50,98 +50,38 @@
       </w:pPr>
       <w:r>
         <w:rPr/>
-        <w:t xml:space="preserve">Sofern </w:t>
-      </w:r>
-      <w:r>
-        <w:rPr/>
-        <w:t>du</w:t>
-      </w:r>
-      <w:r>
-        <w:rPr/>
-        <w:t xml:space="preserve"> </w:t>
-      </w:r>
-      <w:r>
-        <w:rPr/>
-        <w:t>Dienstleistungen von rakuhn</w:t>
-      </w:r>
-      <w:r>
-        <w:rPr/>
-        <w:t xml:space="preserve"> über </w:t>
-      </w:r>
-      <w:r>
-        <w:rPr/>
-        <w:t>meine</w:t>
-      </w:r>
-      <w:r>
-        <w:rPr/>
-        <w:t xml:space="preserve"> Internetseite in Anspruch nehmen möchte</w:t>
-      </w:r>
-      <w:r>
-        <w:rPr/>
-        <w:t>st</w:t>
-      </w:r>
-      <w:r>
-        <w:rPr/>
-        <w:t xml:space="preserve">, könnte jedoch eine Verarbeitung personenbezogener Daten erforderlich werden. Ist die Verarbeitung personenbezogener Daten erforderlich und besteht für eine solche Verarbeitung keine gesetzliche Grundlage, hole </w:t>
-      </w:r>
-      <w:r>
-        <w:rPr/>
-        <w:t>ich</w:t>
-      </w:r>
-      <w:r>
-        <w:rPr/>
-        <w:t xml:space="preserve"> generell eine Einwilligung </w:t>
-      </w:r>
-      <w:r>
-        <w:rPr/>
-        <w:t>von dir</w:t>
-      </w:r>
-      <w:r>
-        <w:rPr/>
-        <w:t xml:space="preserve"> ein.</w:t>
-      </w:r>
-    </w:p>
-    <w:p>
-      <w:pPr>
-        <w:pStyle w:val="Normal"/>
-        <w:rPr/>
-      </w:pPr>
-      <w:r>
-        <w:rPr/>
-        <w:t xml:space="preserve">Die Verarbeitung personenbezogener Daten, beispielsweise des Namens, der Anschrift, E-Mail-Adresse oder Telefonnummer, erfolgt stets im Einklang mit der Datenschutz-Grundverordnung und in Übereinstimmung mit den für </w:t>
-      </w:r>
-      <w:r>
-        <w:rPr/>
-        <w:t>rakuhn</w:t>
-      </w:r>
-      <w:r>
-        <w:rPr/>
-        <w:t xml:space="preserve"> geltenden landesspezifischen Datenschutzbestimmungen. </w:t>
+        <w:t xml:space="preserve">Sofern du Dienstleistungen von rakuhn über meine Internetseite in Anspruch nehmen möchtest, könnte jedoch eine Verarbeitung personenbezogener Daten erforderlich werden. </w:t>
       </w:r>
       <w:commentRangeStart w:id="1"/>
       <w:r>
         <w:rPr/>
-        <w:t xml:space="preserve">Mittels dieser Datenschutzerklärung möchte </w:t>
-      </w:r>
-      <w:r>
-        <w:rPr/>
-        <w:t>ich</w:t>
-      </w:r>
-      <w:r>
-        <w:rPr/>
-        <w:t xml:space="preserve"> die Öffentlichkeit über Art, Umfang und Zweck der von </w:t>
-      </w:r>
-      <w:r>
-        <w:rPr/>
-        <w:t>mir</w:t>
-      </w:r>
-      <w:r>
-        <w:rPr/>
-        <w:t xml:space="preserve"> erhobenen, genutzten und verarbeiteten personenbezogenen Daten informieren. Ferner werden betroffene Personen mittels dieser Datenschutzerklärung über die ihnen zustehenden Rechte aufgeklärt.</w:t>
+        <w:t>Ist die Verarbeitung personenbezogener Daten erforderlich und besteht für eine solche Verarbeitung keine gesetzliche Grundlage, hole ich generell eine Einwilligung von dir ein.</w:t>
       </w:r>
       <w:commentRangeEnd w:id="1"/>
       <w:r>
         <w:commentReference w:id="1"/>
+      </w:r>
+      <w:r>
+        <w:rPr/>
+      </w:r>
+    </w:p>
+    <w:p>
+      <w:pPr>
+        <w:pStyle w:val="Normal"/>
+        <w:rPr/>
+      </w:pPr>
+      <w:r>
+        <w:rPr/>
+        <w:t xml:space="preserve">Die Verarbeitung personenbezogener Daten, beispielsweise des Namens, der Anschrift, E-Mail-Adresse oder Telefonnummer, erfolgt stets im Einklang mit der Datenschutz-Grundverordnung und in Übereinstimmung mit den für rakuhn geltenden landesspezifischen Datenschutzbestimmungen. </w:t>
+      </w:r>
+      <w:commentRangeStart w:id="2"/>
+      <w:r>
+        <w:rPr/>
+        <w:t>Mittels dieser Datenschutzerklärung möchte ich die Öffentlichkeit über Art, Umfang und Zweck der von mir erhobenen, genutzten und verarbeiteten personenbezogenen Daten informieren. Ferner werden betroffene Personen mittels dieser Datenschutzerklärung über die ihnen zustehenden Rechte aufgeklärt.</w:t>
+      </w:r>
+      <w:commentRangeEnd w:id="2"/>
+      <w:r>
+        <w:commentReference w:id="2"/>
       </w:r>
       <w:r>
         <w:rPr/>
@@ -168,33 +108,41 @@
           <w:em w:val="none"/>
         </w:rPr>
       </w:pPr>
-      <w:r>
-        <w:rPr/>
-        <w:t>Mein Unternehmen rakuhn h</w:t>
-      </w:r>
-      <w:r>
-        <w:rPr/>
-        <w:t>at für die Verarbeitung Verantwortlicher zahlreiche technische und organisatorische Maßnahmen umgesetzt, um einen möglichst lückenlosen Schutz der über diese Internetseite verarbeiteten personenbezogenen Daten sicherzustellen. Dennoch können Internetbasierte Datenübertragungen grundsätzlich Sicherheitslücken aufweisen, sodass ein absoluter Schutz nicht gewährleistet werden kann. Aus diesem Grund steht es jeder betroffenen Person frei, personenbezogene Daten auch auf alternativen Wegen, beispielsweise telefonisch, an uns zu übermitteln.</w:t>
-      </w:r>
-    </w:p>
-    <w:p>
-      <w:pPr>
-        <w:pStyle w:val="Normal"/>
-        <w:rPr>
-          <w:b/>
-          <w:b/>
-        </w:rPr>
-      </w:pPr>
-      <w:commentRangeStart w:id="2"/>
+      <w:commentRangeStart w:id="3"/>
+      <w:r>
+        <w:rPr/>
+        <w:t>Mein Unternehmen rakuhn hat für die Verarbeitung Verantwortlicher zahlreiche technische und organisatorische Maßnahmen umgesetzt, um einen möglichst lückenlosen Schutz der über diese Internetseite verarbeiteten personenbezogenen Daten sicherzustellen. Dennoch können</w:t>
+      </w:r>
+      <w:r>
+        <w:rPr/>
+      </w:r>
+      <w:commentRangeEnd w:id="3"/>
+      <w:r>
+        <w:commentReference w:id="3"/>
+      </w:r>
+      <w:r>
+        <w:rPr/>
+        <w:t xml:space="preserve"> Internetbasierte Datenübertragungen grundsätzlich Sicherheitslücken aufweisen, sodass ein absoluter Schutz nicht gewährleistet werden kann. Aus diesem Grund steht es jeder betroffenen Person frei, personenbezogene Daten auch auf alternativen Wegen, beispielsweise telefonisch, an uns zu übermitteln.</w:t>
+      </w:r>
+    </w:p>
+    <w:p>
+      <w:pPr>
+        <w:pStyle w:val="Normal"/>
+        <w:rPr>
+          <w:b/>
+          <w:b/>
+        </w:rPr>
+      </w:pPr>
+      <w:commentRangeStart w:id="4"/>
       <w:r>
         <w:rPr>
           <w:b/>
         </w:rPr>
         <w:t>1. Begriffsbestimmungen</w:t>
       </w:r>
-      <w:commentRangeEnd w:id="2"/>
-      <w:r>
-        <w:commentReference w:id="2"/>
+      <w:commentRangeEnd w:id="4"/>
+      <w:r>
+        <w:commentReference w:id="4"/>
       </w:r>
       <w:r>
         <w:rPr>
@@ -622,15 +570,7 @@
       </w:pPr>
       <w:r>
         <w:rPr/>
-        <w:t xml:space="preserve">Tel.: </w:t>
-      </w:r>
-      <w:r>
-        <w:rPr/>
-        <w:t>0</w:t>
-      </w:r>
-      <w:r>
-        <w:rPr/>
-        <w:t>159 05 31 5</w:t>
+        <w:t>Tel.: 0159 05 31 5</w:t>
       </w:r>
       <w:r>
         <w:rPr>
@@ -700,22 +640,20 @@
         </w:rPr>
         <w:t xml:space="preserve">Website: </w:t>
       </w:r>
-      <w:hyperlink r:id="rId4">
-        <w:r>
-          <w:rPr>
-            <w:rStyle w:val="Internetverknpfung"/>
-            <w:rFonts w:eastAsia="Calibri" w:cs="" w:cstheme="minorBidi" w:eastAsiaTheme="minorHAnsi"/>
-            <w:color w:val="000000"/>
-            <w:kern w:val="0"/>
-            <w:sz w:val="22"/>
-            <w:szCs w:val="22"/>
-            <w:u w:val="none"/>
-            <w:shd w:fill="auto" w:val="clear"/>
-            <w:lang w:val="de-DE" w:eastAsia="en-US" w:bidi="ar-SA"/>
-          </w:rPr>
-          <w:t>www.made-by-rakuhn.de</w:t>
-        </w:r>
-      </w:hyperlink>
+      <w:r>
+        <w:rPr>
+          <w:rStyle w:val="Internetverknpfung"/>
+          <w:rFonts w:eastAsia="Calibri" w:cs="" w:cstheme="minorBidi" w:eastAsiaTheme="minorHAnsi"/>
+          <w:color w:val="000000"/>
+          <w:kern w:val="0"/>
+          <w:sz w:val="22"/>
+          <w:szCs w:val="22"/>
+          <w:u w:val="none"/>
+          <w:shd w:fill="auto" w:val="clear"/>
+          <w:lang w:val="de-DE" w:eastAsia="en-US" w:bidi="ar-SA"/>
+        </w:rPr>
+        <w:t>www.made-by-rakuhn.de</w:t>
+      </w:r>
     </w:p>
     <w:p>
       <w:pPr>
@@ -734,7 +672,16 @@
         </w:rPr>
       </w:pPr>
       <w:r>
-        <w:rPr/>
+        <w:rPr>
+          <w:rFonts w:eastAsia="Calibri" w:cs="" w:cstheme="minorBidi" w:eastAsiaTheme="minorHAnsi"/>
+          <w:color w:val="000000"/>
+          <w:kern w:val="0"/>
+          <w:sz w:val="22"/>
+          <w:szCs w:val="22"/>
+          <w:u w:val="none"/>
+          <w:shd w:fill="auto" w:val="clear"/>
+          <w:lang w:val="de-DE" w:eastAsia="en-US" w:bidi="ar-SA"/>
+        </w:rPr>
       </w:r>
     </w:p>
     <w:p>
@@ -759,19 +706,7 @@
       </w:pPr>
       <w:r>
         <w:rPr/>
-        <w:t>Meine</w:t>
-      </w:r>
-      <w:r>
-        <w:rPr/>
-        <w:t xml:space="preserve"> Internetseite </w:t>
-      </w:r>
-      <w:r>
-        <w:rPr/>
-        <w:t xml:space="preserve">verwendet keine </w:t>
-      </w:r>
-      <w:r>
-        <w:rPr/>
-        <w:t xml:space="preserve">Cookies. </w:t>
+        <w:t xml:space="preserve">Meine Internetseite verwendet keine Cookies. </w:t>
       </w:r>
     </w:p>
     <w:p>
@@ -805,23 +740,7 @@
       </w:pPr>
       <w:r>
         <w:rPr/>
-        <w:t>Es</w:t>
-      </w:r>
-      <w:r>
-        <w:rPr/>
-        <w:t xml:space="preserve"> werden keine </w:t>
-      </w:r>
-      <w:r>
-        <w:rPr/>
-        <w:t xml:space="preserve">Logfiles des Servers </w:t>
-      </w:r>
-      <w:r>
-        <w:rPr/>
-        <w:t xml:space="preserve">erstellt bzw. </w:t>
-      </w:r>
-      <w:r>
-        <w:rPr/>
-        <w:t xml:space="preserve">gespeichert. </w:t>
+        <w:t xml:space="preserve">Es werden keine Logfiles des Servers erstellt bzw. gespeichert. </w:t>
       </w:r>
     </w:p>
     <w:p>
@@ -855,15 +774,47 @@
       </w:pPr>
       <w:r>
         <w:rPr/>
-        <w:t xml:space="preserve">Die Internetseite </w:t>
-      </w:r>
-      <w:r>
-        <w:rPr/>
-        <w:t xml:space="preserve">von rakuhn </w:t>
-      </w:r>
-      <w:r>
-        <w:rPr/>
-        <w:t xml:space="preserve">enthält aufgrund von gesetzlichen Vorschriften Angaben, die eine schnelle elektronische Kontaktaufnahme zu </w:t>
+        <w:t xml:space="preserve">Die Internetseite von rakuhn enthält aufgrund von gesetzlichen Vorschriften Angaben, die eine schnelle elektronische Kontaktaufnahme zu rakuhn sowie eine unmittelbare Kommunikation mit mir ermöglichen, was ebenfalls eine allgemeine Adresse der sogenannten elektronischen Post (E-Mail-Adresse) umfasst. Sofern </w:t>
+      </w:r>
+      <w:r>
+        <w:rPr/>
+        <w:t>du</w:t>
+      </w:r>
+      <w:r>
+        <w:rPr/>
+        <w:t xml:space="preserve"> per E-Mail oder über ein Kontaktformular den Kontakt mit </w:t>
+      </w:r>
+      <w:r>
+        <w:rPr/>
+        <w:t xml:space="preserve">rakuhn </w:t>
+      </w:r>
+      <w:r>
+        <w:rPr/>
+        <w:t>aufnimm</w:t>
+      </w:r>
+      <w:r>
+        <w:rPr/>
+        <w:t>s</w:t>
+      </w:r>
+      <w:r>
+        <w:rPr/>
+        <w:t>t, werden d</w:t>
+      </w:r>
+      <w:r>
+        <w:rPr/>
+        <w:t>eine</w:t>
+      </w:r>
+      <w:r>
+        <w:rPr/>
+        <w:t xml:space="preserve"> übermittelten personenbezogenen Daten automatisch gespeichert. Solche auf freiwilliger Basis von </w:t>
+      </w:r>
+      <w:r>
+        <w:rPr/>
+        <w:t>dir</w:t>
+      </w:r>
+      <w:r>
+        <w:rPr/>
+        <w:t xml:space="preserve"> an </w:t>
       </w:r>
       <w:r>
         <w:rPr/>
@@ -871,27 +822,29 @@
       </w:r>
       <w:r>
         <w:rPr/>
-        <w:t xml:space="preserve"> sowie eine unmittelbare Kommunikation mit </w:t>
-      </w:r>
-      <w:r>
-        <w:rPr/>
-        <w:t>mir</w:t>
-      </w:r>
-      <w:r>
-        <w:rPr/>
-        <w:t xml:space="preserve"> ermöglichen, was ebenfalls eine allgemeine Adresse der sogenannten elektronischen Post (E-Mail-Adresse) umfasst. Sofern eine betroffene Person per E-Mail oder über ein Kontaktformular den Kontakt mit dem für die Verarbeitung Verantwortlichen aufnimmt, werden die von der betroffenen Person übermittelten personenbezogenen Daten automatisch gespeichert. Solche auf freiwilliger Basis von einer betroffenen Person an den für die Verarbeitung Verantwortlichen übermittelten personenbezogenen Daten werden für Zwecke der Bearbeitung oder der Kontaktaufnahme zur betroffenen Person gespeichert. Es erfolgt keine Weitergabe dieser personenbezogenen Daten an Dritte.</w:t>
-      </w:r>
-    </w:p>
-    <w:p>
-      <w:pPr>
-        <w:pStyle w:val="Normal"/>
-        <w:rPr>
-          <w:b/>
-          <w:b/>
-        </w:rPr>
-      </w:pPr>
-      <w:r>
-        <w:rPr/>
+        <w:t xml:space="preserve"> übermittelten personenbezogenen Daten werden für Zwecke der Bearbeitung oder der Kontaktaufnahme zur </w:t>
+      </w:r>
+      <w:r>
+        <w:rPr/>
+        <w:t>dir</w:t>
+      </w:r>
+      <w:r>
+        <w:rPr/>
+        <w:t xml:space="preserve"> gespeichert. Es erfolgt keine Weitergabe dieser personenbezogenen Daten an Dritte.</w:t>
+      </w:r>
+    </w:p>
+    <w:p>
+      <w:pPr>
+        <w:pStyle w:val="Normal"/>
+        <w:rPr>
+          <w:b/>
+          <w:b/>
+        </w:rPr>
+      </w:pPr>
+      <w:r>
+        <w:rPr>
+          <w:b/>
+        </w:rPr>
       </w:r>
     </w:p>
     <w:p>
@@ -1257,62 +1210,22 @@
       </w:pPr>
       <w:r>
         <w:rPr/>
-        <w:t xml:space="preserve">Sofern einer der oben genannten Gründe zutrifft und eine betroffene Person die Löschung von personenbezogenen Daten, die bei </w:t>
-      </w:r>
-      <w:r>
-        <w:rPr/>
-        <w:t xml:space="preserve">rakuhn </w:t>
-      </w:r>
-      <w:r>
-        <w:rPr/>
-        <w:t xml:space="preserve">gespeichert sind, veranlassen möchte, kann sie sich hierzu jederzeit an unseren Datenschutzbeauftragten oder einen anderen Mitarbeiter des für die Verarbeitung Verantwortlichen wenden. Der Datenschutzbeauftragte </w:t>
-      </w:r>
-      <w:r>
-        <w:rPr/>
-        <w:t>von rakuhn</w:t>
-      </w:r>
-      <w:r>
-        <w:rPr/>
-        <w:t xml:space="preserve"> oder ein anderer Mitarbeiter wird veranlassen, dass dem Löschverlangen unverzüglich nachgekommen wird.</w:t>
-      </w:r>
-    </w:p>
-    <w:p>
-      <w:pPr>
-        <w:pStyle w:val="Normal"/>
-        <w:rPr/>
-      </w:pPr>
-      <w:commentRangeStart w:id="3"/>
-      <w:r>
-        <w:rPr/>
-        <w:t xml:space="preserve">Wurden die personenbezogenen Daten von </w:t>
-      </w:r>
-      <w:r>
-        <w:rPr/>
-        <w:t xml:space="preserve">rakuhn </w:t>
-      </w:r>
-      <w:r>
-        <w:rPr/>
-        <w:t xml:space="preserve">öffentlich gemacht und ist unser Unternehmen als Verantwortlicher gemäß Art. 17 Abs. 1 DS-GVO zur Löschung der personenbezogenen Daten verpflichtet, so trifft </w:t>
-      </w:r>
-      <w:r>
-        <w:rPr/>
-        <w:t>rakuhn</w:t>
-      </w:r>
-      <w:r>
-        <w:rPr/>
-        <w:t xml:space="preserve"> unter Berücksichtigung der verfügbaren Technologie und der Implementierungskosten angemessene Maßnahmen, auch technischer Art, um andere für die Datenverarbeitung Verantwortliche, welche die veröffentlichten personenbezogenen Daten verarbeiten, darüber in Kenntnis zu setzen, dass die betroffene Person von diesen anderen für die Datenverarbeitung Verantwortlichen die Löschung sämtlicher Links zu diesen personenbezogenen Daten oder von Kopien oder Replikationen dieser personenbezogenen Daten verlangt hat, soweit die Verarbeitung nicht erforderlich ist. Der Datenschutzbeauftragte </w:t>
-      </w:r>
-      <w:r>
-        <w:rPr/>
-        <w:t>von rakuhn</w:t>
-      </w:r>
-      <w:r>
-        <w:rPr/>
-        <w:t xml:space="preserve"> oder ein anderer Mitarbeiter wird im Einzelfall das Notwendige veranlassen.</w:t>
-      </w:r>
-      <w:commentRangeEnd w:id="3"/>
-      <w:r>
-        <w:commentReference w:id="3"/>
+        <w:t>Sofern einer der oben genannten Gründe zutrifft und eine betroffene Person die Löschung von personenbezogenen Daten, die bei rakuhn gespeichert sind, veranlassen möchte, kann sie sich hierzu jederzeit an unseren Datenschutzbeauftragten oder einen anderen Mitarbeiter des für die Verarbeitung Verantwortlichen wenden. Der Datenschutzbeauftragte von rakuhn oder ein anderer Mitarbeiter wird veranlassen, dass dem Löschverlangen unverzüglich nachgekommen wird.</w:t>
+      </w:r>
+    </w:p>
+    <w:p>
+      <w:pPr>
+        <w:pStyle w:val="Normal"/>
+        <w:rPr/>
+      </w:pPr>
+      <w:commentRangeStart w:id="5"/>
+      <w:r>
+        <w:rPr/>
+        <w:t>Wurden die personenbezogenen Daten von rakuhn öffentlich gemacht und ist unser Unternehmen als Verantwortlicher gemäß Art. 17 Abs. 1 DS-GVO zur Löschung der personenbezogenen Daten verpflichtet, so trifft rakuhn unter Berücksichtigung der verfügbaren Technologie und der Implementierungskosten angemessene Maßnahmen, auch technischer Art, um andere für die Datenverarbeitung Verantwortliche, welche die veröffentlichten personenbezogenen Daten verarbeiten, darüber in Kenntnis zu setzen, dass die betroffene Person von diesen anderen für die Datenverarbeitung Verantwortlichen die Löschung sämtlicher Links zu diesen personenbezogenen Daten oder von Kopien oder Replikationen dieser personenbezogenen Daten verlangt hat, soweit die Verarbeitung nicht erforderlich ist. Der Datenschutzbeauftragte von rakuhn oder ein anderer Mitarbeiter wird im Einzelfall das Notwendige veranlassen.</w:t>
+      </w:r>
+      <w:commentRangeEnd w:id="5"/>
+      <w:r>
+        <w:commentReference w:id="5"/>
       </w:r>
       <w:r>
         <w:rPr/>
@@ -1433,14 +1346,14 @@
         <w:rPr/>
         <w:t xml:space="preserve">f)     Recht auf </w:t>
       </w:r>
-      <w:commentRangeStart w:id="4"/>
+      <w:commentRangeStart w:id="6"/>
       <w:r>
         <w:rPr/>
         <w:t>Datenübertragbarkeit</w:t>
       </w:r>
-      <w:commentRangeEnd w:id="4"/>
-      <w:r>
-        <w:commentReference w:id="4"/>
+      <w:commentRangeEnd w:id="6"/>
+      <w:r>
+        <w:commentReference w:id="6"/>
       </w:r>
       <w:r>
         <w:rPr/>
@@ -1473,30 +1386,22 @@
       </w:pPr>
       <w:r>
         <w:rPr/>
-        <w:t xml:space="preserve">Zur Geltendmachung des Rechts auf Datenübertragbarkeit kann sich die betroffene Person jederzeit an den von </w:t>
-      </w:r>
-      <w:r>
-        <w:rPr/>
-        <w:t>rakuhn</w:t>
-      </w:r>
-      <w:r>
-        <w:rPr/>
-        <w:t xml:space="preserve"> bestellten Datenschutzbeauftragten oder einen anderen Mitarbeiter wenden.</w:t>
-      </w:r>
-    </w:p>
-    <w:p>
-      <w:pPr>
-        <w:pStyle w:val="Normal"/>
-        <w:rPr/>
-      </w:pPr>
-      <w:commentRangeStart w:id="5"/>
+        <w:t>Zur Geltendmachung des Rechts auf Datenübertragbarkeit kann sich die betroffene Person jederzeit an den von rakuhn bestellten Datenschutzbeauftragten oder einen anderen Mitarbeiter wenden.</w:t>
+      </w:r>
+    </w:p>
+    <w:p>
+      <w:pPr>
+        <w:pStyle w:val="Normal"/>
+        <w:rPr/>
+      </w:pPr>
+      <w:commentRangeStart w:id="7"/>
       <w:r>
         <w:rPr/>
         <w:t>g)    Recht auf Widerspruch</w:t>
       </w:r>
-      <w:commentRangeEnd w:id="5"/>
-      <w:r>
-        <w:commentReference w:id="5"/>
+      <w:commentRangeEnd w:id="7"/>
+      <w:r>
+        <w:commentReference w:id="7"/>
       </w:r>
       <w:r>
         <w:rPr/>
@@ -1519,30 +1424,18 @@
       </w:pPr>
       <w:r>
         <w:rPr/>
-        <w:t>rakuhn v</w:t>
-      </w:r>
-      <w:r>
-        <w:rPr/>
-        <w:t>erarbeitet die personenbezogenen Daten im Falle des Widerspruchs nicht mehr, es sei denn, wir können zwingende schutzwürdige Gründe für die Verarbeitung nachweisen, die den Interessen, Rechten und Freiheiten der betroffenen Person überwiegen, oder die Verarbeitung dient der Geltendmachung, Ausübung oder Verteidigung von Rechtsansprüchen.</w:t>
-      </w:r>
-    </w:p>
-    <w:p>
-      <w:pPr>
-        <w:pStyle w:val="Normal"/>
-        <w:rPr/>
-      </w:pPr>
-      <w:commentRangeStart w:id="6"/>
-      <w:r>
-        <w:rPr/>
-        <w:t xml:space="preserve">Verarbeitet </w:t>
-      </w:r>
-      <w:r>
-        <w:rPr/>
-        <w:t xml:space="preserve">rakuhn </w:t>
-      </w:r>
-      <w:r>
-        <w:rPr/>
-        <w:t xml:space="preserve">personenbezogene Daten, um Direktwerbung zu betreiben, so hat die betroffene Person das Recht, jederzeit Widerspruch gegen die Verarbeitung der personenbezogenen Daten zum Zwecke derartiger Werbung einzulegen. Dies gilt auch für das Profiling, soweit es mit solcher Direktwerbung in Verbindung steht. Widerspricht die betroffene Person gegenüber der </w:t>
+        <w:t>rakuhn verarbeitet die personenbezogenen Daten im Falle des Widerspruchs nicht mehr, es sei denn, wir können zwingende schutzwürdige Gründe für die Verarbeitung nachweisen, die den Interessen, Rechten und Freiheiten der betroffenen Person überwiegen, oder die Verarbeitung dient der Geltendmachung, Ausübung oder Verteidigung von Rechtsansprüchen.</w:t>
+      </w:r>
+    </w:p>
+    <w:p>
+      <w:pPr>
+        <w:pStyle w:val="Normal"/>
+        <w:rPr/>
+      </w:pPr>
+      <w:commentRangeStart w:id="8"/>
+      <w:r>
+        <w:rPr/>
+        <w:t xml:space="preserve">Verarbeitet rakuhn personenbezogene Daten, um Direktwerbung zu betreiben, so hat die betroffene Person das Recht, jederzeit Widerspruch gegen die Verarbeitung der personenbezogenen Daten zum Zwecke derartiger Werbung einzulegen. Dies gilt auch für das Profiling, soweit es mit solcher Direktwerbung in Verbindung steht. Widerspricht die betroffene Person gegenüber der </w:t>
       </w:r>
       <w:r>
         <w:rPr>
@@ -1564,56 +1457,40 @@
         <w:rPr/>
         <w:t xml:space="preserve"> die personenbezogenen Daten nicht mehr für diese Zwecke verarbeiten.</w:t>
       </w:r>
-      <w:commentRangeEnd w:id="6"/>
-      <w:r>
-        <w:commentReference w:id="6"/>
-      </w:r>
-      <w:r>
-        <w:rPr/>
-      </w:r>
-    </w:p>
-    <w:p>
-      <w:pPr>
-        <w:pStyle w:val="Normal"/>
-        <w:rPr/>
-      </w:pPr>
-      <w:commentRangeStart w:id="7"/>
-      <w:r>
-        <w:rPr/>
-        <w:t xml:space="preserve">Zudem hat die betroffene Person das Recht, aus Gründen, die sich aus ihrer besonderen Situation ergeben, gegen die sie betreffende Verarbeitung personenbezogener Daten, die bei </w:t>
-      </w:r>
-      <w:r>
-        <w:rPr/>
-        <w:t>rakuhn</w:t>
-      </w:r>
-      <w:r>
-        <w:rPr/>
-        <w:t xml:space="preserve"> zu wissenschaftlichen oder historischen Forschungszwecken oder zu statistischen Zwecken gemäß Art. 89 Abs. 1 DS-GVO erfolgen, Widerspruch einzulegen, es sei denn, eine solche Verarbeitung ist zur Erfüllung einer im öffentlichen Interesse liegenden Aufgabe erforderlich.</w:t>
-      </w:r>
-      <w:commentRangeEnd w:id="7"/>
-      <w:r>
-        <w:commentReference w:id="7"/>
-      </w:r>
-      <w:r>
-        <w:rPr/>
-      </w:r>
-    </w:p>
-    <w:p>
-      <w:pPr>
-        <w:pStyle w:val="Normal"/>
-        <w:rPr/>
-      </w:pPr>
-      <w:r>
-        <w:rPr/>
-        <w:t xml:space="preserve">Zur Ausübung des Rechts auf Widerspruch kann sich die betroffene Person direkt an den Datenschutzbeauftragten </w:t>
-      </w:r>
-      <w:r>
-        <w:rPr/>
-        <w:t xml:space="preserve">von rakuhn </w:t>
-      </w:r>
-      <w:r>
-        <w:rPr/>
-        <w:t>oder einen anderen Mitarbeiter wenden. Der betroffenen Person steht es ferner frei, im Zusammenhang mit der Nutzung von Diensten der Informationsgesellschaft, ungeachtet der Richtlinie 2002/58/EG, ihr Widerspruchsrecht mittels automatisierter Verfahren auszuüben, bei denen technische Spezifikationen verwendet werden.</w:t>
+      <w:commentRangeEnd w:id="8"/>
+      <w:r>
+        <w:commentReference w:id="8"/>
+      </w:r>
+      <w:r>
+        <w:rPr/>
+      </w:r>
+    </w:p>
+    <w:p>
+      <w:pPr>
+        <w:pStyle w:val="Normal"/>
+        <w:rPr/>
+      </w:pPr>
+      <w:commentRangeStart w:id="9"/>
+      <w:r>
+        <w:rPr/>
+        <w:t>Zudem hat die betroffene Person das Recht, aus Gründen, die sich aus ihrer besonderen Situation ergeben, gegen die sie betreffende Verarbeitung personenbezogener Daten, die bei rakuhn zu wissenschaftlichen oder historischen Forschungszwecken oder zu statistischen Zwecken gemäß Art. 89 Abs. 1 DS-GVO erfolgen, Widerspruch einzulegen, es sei denn, eine solche Verarbeitung ist zur Erfüllung einer im öffentlichen Interesse liegenden Aufgabe erforderlich.</w:t>
+      </w:r>
+      <w:commentRangeEnd w:id="9"/>
+      <w:r>
+        <w:commentReference w:id="9"/>
+      </w:r>
+      <w:r>
+        <w:rPr/>
+      </w:r>
+    </w:p>
+    <w:p>
+      <w:pPr>
+        <w:pStyle w:val="Normal"/>
+        <w:rPr/>
+      </w:pPr>
+      <w:r>
+        <w:rPr/>
+        <w:t>Zur Ausübung des Rechts auf Widerspruch kann sich die betroffene Person direkt an den Datenschutzbeauftragten von rakuhn oder einen anderen Mitarbeiter wenden. Der betroffenen Person steht es ferner frei, im Zusammenhang mit der Nutzung von Diensten der Informationsgesellschaft, ungeachtet der Richtlinie 2002/58/EG, ihr Widerspruchsrecht mittels automatisierter Verfahren auszuüben, bei denen technische Spezifikationen verwendet werden.</w:t>
       </w:r>
     </w:p>
     <w:p>
@@ -1625,14 +1502,14 @@
         <w:rPr/>
         <w:t xml:space="preserve">h)    Automatisierte Entscheidungen im Einzelfall einschließlich </w:t>
       </w:r>
-      <w:commentRangeStart w:id="8"/>
+      <w:commentRangeStart w:id="10"/>
       <w:r>
         <w:rPr/>
         <w:t>Profiling</w:t>
       </w:r>
-      <w:commentRangeEnd w:id="8"/>
-      <w:r>
-        <w:commentReference w:id="8"/>
+      <w:commentRangeEnd w:id="10"/>
+      <w:r>
+        <w:commentReference w:id="10"/>
       </w:r>
       <w:r>
         <w:rPr/>
@@ -1716,29 +1593,47 @@
           <w:b/>
         </w:rPr>
       </w:pPr>
+      <w:commentRangeStart w:id="11"/>
       <w:r>
         <w:rPr>
           <w:b/>
         </w:rPr>
         <w:t>14. Rechtsgrundlage der Verarbeitung</w:t>
       </w:r>
-    </w:p>
-    <w:p>
-      <w:pPr>
-        <w:pStyle w:val="Normal"/>
-        <w:rPr/>
-      </w:pPr>
-      <w:r>
-        <w:rPr/>
-        <w:t xml:space="preserve">Art. 6 I lit. a DS-GVO dient </w:t>
-      </w:r>
-      <w:r>
-        <w:rPr/>
-        <w:t>meinem</w:t>
-      </w:r>
-      <w:r>
-        <w:rPr/>
-        <w:t xml:space="preserve"> Unternehmen als Rechtsgrundlage für Verarbeitungsvorgänge, bei denen wir eine Einwilligung für einen bestimmten Verarbeitungszweck einholen. Ist die Verarbeitung personenbezogener Daten zur Erfüllung eines Vertrags, dessen Vertragspartei die betroffene Person ist, erforderlich, wie dies beispielsweise bei Verarbeitungsvorgängen der Fall ist, die für eine Lieferung von Waren oder die Erbringung einer sonstigen Leistung oder Gegenleistung notwendig sind, so beruht die Verarbeitung auf Art. 6 I lit. b DS-GVO. Gleiches gilt für solche Verarbeitungsvorgänge die zur Durchführung vorvertraglicher Maßnahmen erforderlich sind, etwa in Fällen von Anfragen zur unseren Produkten oder Leistungen. Unterliegt unser Unternehmen einer rechtlichen Verpflichtung durch welche eine Verarbeitung von personenbezogenen Daten erforderlich wird, wie beispielsweise zur Erfüllung steuerlicher Pflichten, so basiert die Verarbeitung auf Art. 6 I lit. c DS-GVO. In seltenen Fällen könnte die Verarbeitung von personenbezogenen Daten erforderlich werden, um lebenswichtige Interessen der betroffenen Person oder einer anderen natürlichen Person zu schützen. Dies wäre beispielsweise der Fall, wenn ein Besucher in unserem Betrieb verletzt werden würde und daraufhin sein Name, sein Alter, seine Krankenkassendaten oder sonstige lebenswichtige Informationen an einen Arzt, ein Krankenhaus oder sonstige Dritte weitergegeben werden müssten. Dann würde die Verarbeitung auf Art. 6 I lit. d DS-GVO beruhen. Letztlich könnten Verarbeitungsvorgänge auf Art. 6 I lit. f DS-GVO beruhen. Auf dieser Rechtsgrundlage basieren Verarbeitungsvorgänge, die von keiner der vorgenannten Rechtsgrundlagen erfasst werden, wenn die Verarbeitung zur Wahrung eines berechtigten Interesses unseres Unternehmens oder eines Dritten erforderlich ist, sofern die Interessen, Grundrechte und Grundfreiheiten des Betroffenen nicht überwiegen. Solche Verarbeitungsvorgänge sind uns insbesondere deshalb gestattet, weil sie durch den Europäischen Gesetzgeber besonders erwähnt wurden. Er vertrat insoweit die Auffassung, dass ein berechtigtes Interesse anzunehmen sein könnte, wenn die betroffene Person ein Kunde des Verantwortlichen ist (Erwägungsgrund 47 Satz 2 DS-GVO). </w:t>
+      <w:commentRangeEnd w:id="11"/>
+      <w:r>
+        <w:commentReference w:id="11"/>
+      </w:r>
+      <w:r>
+        <w:rPr>
+          <w:b/>
+        </w:rPr>
+      </w:r>
+    </w:p>
+    <w:p>
+      <w:pPr>
+        <w:pStyle w:val="Normal"/>
+        <w:rPr/>
+      </w:pPr>
+      <w:r>
+        <w:rPr/>
+        <w:t xml:space="preserve">Art. 6 I lit. a DS-GVO dient meinem Unternehmen als Rechtsgrundlage für Verarbeitungsvorgänge, bei denen </w:t>
+      </w:r>
+      <w:commentRangeStart w:id="12"/>
+      <w:r>
+        <w:rPr/>
+        <w:t>wir eine Einwilligung für einen bestimmten Verarbeitungszweck einholen</w:t>
+      </w:r>
+      <w:r>
+        <w:rPr/>
+      </w:r>
+      <w:commentRangeEnd w:id="12"/>
+      <w:r>
+        <w:commentReference w:id="12"/>
+      </w:r>
+      <w:r>
+        <w:rPr/>
+        <w:t xml:space="preserve">. Ist die Verarbeitung personenbezogener Daten zur Erfüllung eines Vertrags, dessen Vertragspartei die betroffene Person ist, erforderlich, wie dies beispielsweise bei Verarbeitungsvorgängen der Fall ist, die für eine Lieferung von Waren oder die Erbringung einer sonstigen Leistung oder Gegenleistung notwendig sind, so beruht die Verarbeitung auf Art. 6 I lit. b DS-GVO. Gleiches gilt für solche Verarbeitungsvorgänge die zur Durchführung vorvertraglicher Maßnahmen erforderlich sind, etwa in Fällen von Anfragen zur unseren Produkten oder Leistungen. Unterliegt unser Unternehmen einer rechtlichen Verpflichtung durch welche eine Verarbeitung von personenbezogenen Daten erforderlich wird, wie beispielsweise zur Erfüllung steuerlicher Pflichten, so basiert die Verarbeitung auf Art. 6 I lit. c DS-GVO. In seltenen Fällen könnte die Verarbeitung von personenbezogenen Daten erforderlich werden, um lebenswichtige Interessen der betroffenen Person oder einer anderen natürlichen Person zu schützen. Dies wäre beispielsweise der Fall, wenn ein Besucher in unserem Betrieb verletzt werden würde und daraufhin sein Name, sein Alter, seine Krankenkassendaten oder sonstige lebenswichtige Informationen an einen Arzt, ein Krankenhaus oder sonstige Dritte weitergegeben werden müssten. Dann würde die Verarbeitung auf Art. 6 I lit. d DS-GVO beruhen. Letztlich könnten Verarbeitungsvorgänge auf Art. 6 I lit. f DS-GVO beruhen. Auf dieser Rechtsgrundlage basieren Verarbeitungsvorgänge, die von keiner der vorgenannten Rechtsgrundlagen erfasst werden, wenn die Verarbeitung zur Wahrung eines berechtigten Interesses unseres Unternehmens oder eines Dritten erforderlich ist, sofern die Interessen, Grundrechte und Grundfreiheiten des Betroffenen nicht überwiegen. Solche Verarbeitungsvorgänge sind uns insbesondere deshalb gestattet, weil sie durch den Europäischen Gesetzgeber besonders erwähnt wurden. Er vertrat insoweit die Auffassung, dass ein berechtigtes Interesse anzunehmen sein könnte, wenn die betroffene Person ein Kunde des Verantwortlichen ist (Erwägungsgrund 47 Satz 2 DS-GVO). </w:t>
       </w:r>
     </w:p>
     <w:p>
@@ -1763,7 +1658,19 @@
       </w:pPr>
       <w:r>
         <w:rPr/>
-        <w:t>Basiert die Verarbeitung personenbezogener Daten auf Artikel 6 I lit. f DS-GVO ist unser berechtigtes Interesse die Durchführung unserer Geschäftstätigkeit zugunsten des Wohlergehens all unserer Mitarbeiter.</w:t>
+        <w:t xml:space="preserve">Basiert die Verarbeitung personenbezogener Daten auf Artikel 6 I lit. f DS-GVO ist unser berechtigtes Interesse die Durchführung unserer Geschäftstätigkeit </w:t>
+      </w:r>
+      <w:commentRangeStart w:id="13"/>
+      <w:r>
+        <w:rPr/>
+        <w:t>zugunsten des Wohlergehens all unserer Mitarbeiter.</w:t>
+      </w:r>
+      <w:commentRangeEnd w:id="13"/>
+      <w:r>
+        <w:commentReference w:id="13"/>
+      </w:r>
+      <w:r>
+        <w:rPr/>
       </w:r>
     </w:p>
     <w:p>
@@ -1813,17 +1720,30 @@
       </w:pPr>
       <w:r>
         <w:rPr/>
-        <w:t xml:space="preserve">Wir klären Sie darüber auf, dass die Bereitstellung personenbezogener Daten zum Teil gesetzlich vorgeschrieben ist (z.B. Steuervorschriften) oder sich auch aus vertraglichen Regelungen (z.B. Angaben zum Vertragspartner) ergeben kann. Mitunter kann es zu einem Vertragsschluss erforderlich sein, dass eine betroffene Person uns personenbezogene Daten zur Verfügung stellt, die in der Folge durch uns verarbeitet werden müssen. Die betroffene Person ist beispielsweise verpflichtet uns personenbezogene Daten bereitzustellen, wenn unser Unternehmen mit ihr einen Vertrag abschließt. Eine Nichtbereitstellung der personenbezogenen Daten hätte zur Folge, dass der Vertrag mit dem Betroffenen nicht geschlossen werden könnte. Vor einer Bereitstellung personenbezogener Daten durch den Betroffenen muss sich der Betroffene an unseren Datenschutzbeauftragten wenden. Unser Datenschutzbeauftragter klärt den Betroffenen einzelfallbezogen darüber auf, ob die Bereitstellung der personenbezogenen Daten gesetzlich oder vertraglich vorgeschrieben oder für den Vertragsabschluss erforderlich ist, ob eine Verpflichtung besteht, die personenbezogenen Daten bereitzustellen, und welche Folgen die Nichtbereitstellung der personenbezogenen Daten hätte. </w:t>
-      </w:r>
-    </w:p>
-    <w:p>
-      <w:pPr>
-        <w:pStyle w:val="Normal"/>
-        <w:rPr>
-          <w:b/>
-          <w:b/>
-        </w:rPr>
-      </w:pPr>
+        <w:t>Wir klären Sie darüber auf, dass die Bereitstellung personenbezogener Daten zum Teil gesetzlich vorgeschrieben ist (z.B. Steuervorschriften) oder sich auch aus vertraglichen Regelungen (z.B. Angaben zum Vertragspartner) ergeben kann. Mitunter kann es zu einem Vertragsschluss erforderlich sein, dass eine betroffene Person uns personenbezogene Daten zur Verfügung stellt, die in der Folge durch uns verarbeitet werden müssen. Die betroffene Person ist beispielsweise verpflichtet uns personenbezogene Daten bereitzustellen, wenn unser Unternehmen mit ihr einen Vertrag abschließt. Eine Nichtbereitstellung der personenbezogenen Daten hätte zur Folge, dass der Vertrag mit dem Betroffenen nicht geschlossen werden könnte. V</w:t>
+      </w:r>
+      <w:commentRangeStart w:id="14"/>
+      <w:r>
+        <w:rPr/>
+        <w:t xml:space="preserve">or einer Bereitstellung personenbezogener Daten durch den Betroffenen muss sich der Betroffene an unseren Datenschutzbeauftragten wenden. Unser Datenschutzbeauftragter klärt den Betroffenen einzelfallbezogen darüber auf, ob die Bereitstellung der personenbezogenen Daten gesetzlich oder vertraglich vorgeschrieben oder für den Vertragsabschluss erforderlich ist, ob eine Verpflichtung besteht, die personenbezogenen Daten bereitzustellen, und welche Folgen die Nichtbereitstellung der personenbezogenen Daten hätte. </w:t>
+      </w:r>
+      <w:commentRangeEnd w:id="14"/>
+      <w:r>
+        <w:commentReference w:id="14"/>
+      </w:r>
+      <w:r>
+        <w:rPr/>
+      </w:r>
+    </w:p>
+    <w:p>
+      <w:pPr>
+        <w:pStyle w:val="Normal"/>
+        <w:rPr>
+          <w:b/>
+          <w:b/>
+        </w:rPr>
+      </w:pPr>
+      <w:commentRangeStart w:id="15"/>
       <w:r>
         <w:rPr>
           <w:b/>
@@ -1839,6 +1759,13 @@
       <w:r>
         <w:rPr/>
         <w:t>Als verantwortungsbewusstes Unternehmen verzichten wir auf eine automatische Entscheidungsfindung oder ein Profiling.</w:t>
+      </w:r>
+      <w:commentRangeEnd w:id="15"/>
+      <w:r>
+        <w:commentReference w:id="15"/>
+      </w:r>
+      <w:r>
+        <w:rPr/>
       </w:r>
     </w:p>
     <w:p>
@@ -1870,72 +1797,6 @@
 <file path=word/comments.xml><?xml version="1.0" encoding="utf-8"?>
 <w:comments xmlns:o="urn:schemas-microsoft-com:office:office" xmlns:r="http://schemas.openxmlformats.org/officeDocument/2006/relationships" xmlns:v="urn:schemas-microsoft-com:vml" xmlns:w="http://schemas.openxmlformats.org/wordprocessingml/2006/main" xmlns:w10="urn:schemas-microsoft-com:office:word" xmlns:wp="http://schemas.openxmlformats.org/drawingml/2006/wordprocessingDrawing" xmlns:wps="http://schemas.microsoft.com/office/word/2010/wordprocessingShape" xmlns:wpg="http://schemas.microsoft.com/office/word/2010/wordprocessingGroup" xmlns:mc="http://schemas.openxmlformats.org/markup-compatibility/2006" xmlns:wp14="http://schemas.microsoft.com/office/word/2010/wordprocessingDrawing" xmlns:w14="http://schemas.microsoft.com/office/word/2010/wordml" xmlns:w15="http://schemas.microsoft.com/office/word/2012/wordml" mc:Ignorable="w14 wp14 w15">
   <w:comment w:id="0" w:author="Unbekannter Autor" w:date="2026-07-08T13:46:16Z" w:initials="">
-    <w:p>
-      <w:r>
-        <w:rPr>
-          <w:rFonts w:eastAsia="Calibri" w:cstheme="minorBidi" w:eastAsiaTheme="minorHAnsi" w:cs="" w:ascii="Calibri" w:hAnsi="Calibri"/>
-          <w:b w:val="false"/>
-          <w:bCs w:val="false"/>
-          <w:i w:val="false"/>
-          <w:iCs w:val="false"/>
-          <w:caps w:val="false"/>
-          <w:smallCaps w:val="false"/>
-          <w:strike w:val="false"/>
-          <w:dstrike w:val="false"/>
-          <w:outline w:val="false"/>
-          <w:shadow w:val="false"/>
-          <w:emboss w:val="false"/>
-          <w:imprint w:val="false"/>
-          <w:color w:val="auto"/>
-          <w:spacing w:val="0"/>
-          <w:w w:val="100"/>
-          <w:kern w:val="0"/>
-          <w:position w:val="0"/>
-          <w:sz w:val="20"/>
-          <w:szCs w:val="22"/>
-          <w:u w:val="none"/>
-          <w:vertAlign w:val="baseline"/>
-          <w:em w:val="none"/>
-          <w:lang w:bidi="ar-SA" w:eastAsia="en-US" w:val="de-DE"/>
-        </w:rPr>
-        <w:t>Darf ich die Datenshutzerklärung mit persönlicher Anrede gestalten oder muss ich die festgelegten Begriffe verwenden um rechtlich auf der sicheren Seite zu sein?</w:t>
-      </w:r>
-    </w:p>
-  </w:comment>
-  <w:comment w:id="1" w:author="Unbekannter Autor" w:date="2026-07-08T13:11:10Z" w:initials="">
-    <w:p>
-      <w:r>
-        <w:rPr>
-          <w:rFonts w:eastAsia="Calibri" w:cstheme="minorBidi" w:eastAsiaTheme="minorHAnsi" w:cs="" w:ascii="Calibri" w:hAnsi="Calibri"/>
-          <w:b w:val="false"/>
-          <w:bCs w:val="false"/>
-          <w:i w:val="false"/>
-          <w:iCs w:val="false"/>
-          <w:caps w:val="false"/>
-          <w:smallCaps w:val="false"/>
-          <w:strike w:val="false"/>
-          <w:dstrike w:val="false"/>
-          <w:outline w:val="false"/>
-          <w:shadow w:val="false"/>
-          <w:emboss w:val="false"/>
-          <w:imprint w:val="false"/>
-          <w:color w:val="auto"/>
-          <w:spacing w:val="0"/>
-          <w:w w:val="100"/>
-          <w:kern w:val="0"/>
-          <w:position w:val="0"/>
-          <w:sz w:val="20"/>
-          <w:szCs w:val="22"/>
-          <w:u w:val="none"/>
-          <w:vertAlign w:val="baseline"/>
-          <w:em w:val="none"/>
-          <w:lang w:bidi="ar-SA" w:eastAsia="en-US" w:val="de-DE"/>
-        </w:rPr>
-        <w:t>Ist dieser Teil gesetzlich vorgeschrieben, oder kann ich ihn löschen?</w:t>
-      </w:r>
-    </w:p>
-  </w:comment>
-  <w:comment w:id="2" w:author="Unbekannter Autor" w:date="2026-07-08T13:49:35Z" w:initials="">
     <w:p>
       <w:r>
         <w:rPr>
@@ -1965,9 +1826,76 @@
           <w:em w:val="none"/>
           <w:lang w:val="de-DE" w:eastAsia="en-US" w:bidi="ar-SA"/>
         </w:rPr>
-        <w:t xml:space="preserve">Müssen diese Begriffsbestimmungen genannt werden? </w:t>
-      </w:r>
-    </w:p>
+        <w:t>Darf ich die Datenshutzerklärung mit persönlicher Anrede gestalten oder muss ich die festgelegten Begriffe verwenden um rechtlich auf der sicheren Seite zu sein?</w:t>
+      </w:r>
+    </w:p>
+  </w:comment>
+  <w:comment w:id="1" w:author="Unbekannter Autor" w:date="2026-07-09T12:14:48Z" w:initials="">
+    <w:p>
+      <w:r>
+        <w:rPr>
+          <w:rFonts w:eastAsia="Calibri" w:cstheme="minorBidi" w:eastAsiaTheme="minorHAnsi" w:cs="" w:ascii="Calibri" w:hAnsi="Calibri"/>
+          <w:b w:val="false"/>
+          <w:bCs w:val="false"/>
+          <w:i w:val="false"/>
+          <w:iCs w:val="false"/>
+          <w:caps w:val="false"/>
+          <w:smallCaps w:val="false"/>
+          <w:strike w:val="false"/>
+          <w:dstrike w:val="false"/>
+          <w:outline w:val="false"/>
+          <w:shadow w:val="false"/>
+          <w:emboss w:val="false"/>
+          <w:imprint w:val="false"/>
+          <w:color w:val="auto"/>
+          <w:spacing w:val="0"/>
+          <w:w w:val="100"/>
+          <w:kern w:val="0"/>
+          <w:position w:val="0"/>
+          <w:sz w:val="20"/>
+          <w:szCs w:val="22"/>
+          <w:u w:val="none"/>
+          <w:vertAlign w:val="baseline"/>
+          <w:em w:val="none"/>
+          <w:lang w:bidi="ar-SA" w:eastAsia="en-US" w:val="de-DE"/>
+        </w:rPr>
+        <w:t>Was wäre ein solcher Fall?</w:t>
+      </w:r>
+    </w:p>
+    <w:p>
+      <w:r>
+        <w:rPr>
+          <w:rFonts w:ascii="Calibri" w:hAnsi="Calibri" w:eastAsia="Calibri" w:cs="" w:asciiTheme="minorHAnsi" w:cstheme="minorBidi" w:eastAsiaTheme="minorHAnsi" w:hAnsiTheme="minorHAnsi"/>
+          <w:b w:val="false"/>
+          <w:bCs w:val="false"/>
+          <w:i w:val="false"/>
+          <w:iCs w:val="false"/>
+          <w:caps w:val="false"/>
+          <w:smallCaps w:val="false"/>
+          <w:strike w:val="false"/>
+          <w:dstrike w:val="false"/>
+          <w:outline w:val="false"/>
+          <w:shadow w:val="false"/>
+          <w:emboss w:val="false"/>
+          <w:imprint w:val="false"/>
+          <w:color w:val="auto"/>
+          <w:spacing w:val="0"/>
+          <w:w w:val="100"/>
+          <w:kern w:val="0"/>
+          <w:position w:val="0"/>
+          <w:sz w:val="20"/>
+          <w:sz w:val="20"/>
+          <w:szCs w:val="22"/>
+          <w:u w:val="none"/>
+          <w:vertAlign w:val="baseline"/>
+          <w:em w:val="none"/>
+          <w:lang w:val="de-DE" w:eastAsia="en-US" w:bidi="ar-SA"/>
+        </w:rPr>
+        <w:t>Kann der Satz ansonsten gelöscht werden?</w:t>
+      </w:r>
+    </w:p>
+  </w:comment>
+  <w:comment w:id="2" w:author="Unbekannter Autor" w:date="2026-07-08T13:11:10Z" w:initials="">
     <w:p>
       <w:r>
         <w:rPr>
@@ -1997,31 +1925,11 @@
           <w:em w:val="none"/>
           <w:lang w:val="de-DE" w:eastAsia="en-US" w:bidi="ar-SA"/>
         </w:rPr>
-        <w:t>Wenn aus dem Folgetext Abschnitte gelöscht werden und die Begriffe nicht mehr enthalten sind (z.B. Profiling etc) kann ich die Begriffe dann aus diesem Absatz löschen?</w:t>
-      </w:r>
-    </w:p>
-    <w:p>
-      <w:r>
-        <w:rPr>
-          <w:rFonts w:ascii="Liberation Serif" w:hAnsi="Liberation Serif" w:eastAsia="DejaVu Sans" w:cs="Noto Sans Arabic UI"/>
-          <w:sz w:val="24"/>
-          <w:szCs w:val="24"/>
-          <w:lang w:val="en-US" w:eastAsia="en-US" w:bidi="en-US"/>
-        </w:rPr>
-      </w:r>
-    </w:p>
-    <w:p>
-      <w:r>
-        <w:rPr>
-          <w:rFonts w:ascii="Liberation Serif" w:hAnsi="Liberation Serif" w:eastAsia="DejaVu Sans" w:cs="Noto Sans Arabic UI"/>
-          <w:sz w:val="24"/>
-          <w:szCs w:val="24"/>
-          <w:lang w:val="en-US" w:eastAsia="en-US" w:bidi="en-US"/>
-        </w:rPr>
+        <w:t>Ist dieser Teil gesetzlich vorgeschrieben, oder kann ich ihn löschen?</w:t>
       </w:r>
     </w:p>
   </w:comment>
-  <w:comment w:id="3" w:author="Unbekannter Autor" w:date="2026-07-08T13:31:06Z" w:initials="">
+  <w:comment w:id="3" w:author="Unbekannter Autor" w:date="2026-07-09T12:28:37Z" w:initials="">
     <w:p>
       <w:r>
         <w:rPr>
@@ -2050,11 +1958,343 @@
           <w:em w:val="none"/>
           <w:lang w:bidi="ar-SA" w:eastAsia="en-US" w:val="de-DE"/>
         </w:rPr>
+        <w:t>Ich habe keine Maßnahmen umgesetzt, diesen Satz dann löschen?</w:t>
+      </w:r>
+    </w:p>
+  </w:comment>
+  <w:comment w:id="4" w:author="Unbekannter Autor" w:date="2026-07-08T13:49:35Z" w:initials="">
+    <w:p>
+      <w:r>
+        <w:rPr>
+          <w:rFonts w:ascii="Calibri" w:hAnsi="Calibri" w:eastAsia="Calibri" w:cs=""/>
+          <w:b w:val="false"/>
+          <w:bCs w:val="false"/>
+          <w:i w:val="false"/>
+          <w:iCs w:val="false"/>
+          <w:caps w:val="false"/>
+          <w:smallCaps w:val="false"/>
+          <w:strike w:val="false"/>
+          <w:dstrike w:val="false"/>
+          <w:outline w:val="false"/>
+          <w:shadow w:val="false"/>
+          <w:emboss w:val="false"/>
+          <w:imprint w:val="false"/>
+          <w:color w:val="auto"/>
+          <w:spacing w:val="0"/>
+          <w:w w:val="100"/>
+          <w:kern w:val="0"/>
+          <w:position w:val="0"/>
+          <w:sz w:val="20"/>
+          <w:sz w:val="20"/>
+          <w:szCs w:val="22"/>
+          <w:u w:val="none"/>
+          <w:vertAlign w:val="baseline"/>
+          <w:em w:val="none"/>
+          <w:lang w:val="de-DE" w:eastAsia="en-US" w:bidi="ar-SA"/>
+        </w:rPr>
+        <w:t xml:space="preserve">Müssen diese Begriffsbestimmungen genannt werden? </w:t>
+      </w:r>
+    </w:p>
+    <w:p>
+      <w:r>
+        <w:rPr>
+          <w:rFonts w:ascii="Calibri" w:hAnsi="Calibri" w:eastAsia="Calibri" w:cs=""/>
+          <w:b w:val="false"/>
+          <w:bCs w:val="false"/>
+          <w:i w:val="false"/>
+          <w:iCs w:val="false"/>
+          <w:caps w:val="false"/>
+          <w:smallCaps w:val="false"/>
+          <w:strike w:val="false"/>
+          <w:dstrike w:val="false"/>
+          <w:outline w:val="false"/>
+          <w:shadow w:val="false"/>
+          <w:emboss w:val="false"/>
+          <w:imprint w:val="false"/>
+          <w:color w:val="auto"/>
+          <w:spacing w:val="0"/>
+          <w:w w:val="100"/>
+          <w:kern w:val="0"/>
+          <w:position w:val="0"/>
+          <w:sz w:val="20"/>
+          <w:sz w:val="20"/>
+          <w:szCs w:val="22"/>
+          <w:u w:val="none"/>
+          <w:vertAlign w:val="baseline"/>
+          <w:em w:val="none"/>
+          <w:lang w:val="de-DE" w:eastAsia="en-US" w:bidi="ar-SA"/>
+        </w:rPr>
+        <w:t>Wenn aus dem Folgetext Abschnitte gelöscht werden und die Begriffe nicht mehr enthalten sind (z.B. Profiling etc) kann ich die Begriffe dann aus diesem Absatz löschen?</w:t>
+      </w:r>
+    </w:p>
+    <w:p>
+      <w:r>
+        <w:rPr>
+          <w:rFonts w:ascii="Liberation Serif" w:hAnsi="Liberation Serif" w:eastAsia="DejaVu Sans" w:cs="Noto Sans Arabic UI"/>
+          <w:sz w:val="24"/>
+          <w:szCs w:val="24"/>
+          <w:lang w:val="en-US" w:eastAsia="en-US" w:bidi="en-US"/>
+        </w:rPr>
+      </w:r>
+    </w:p>
+    <w:p>
+      <w:r>
+        <w:rPr>
+          <w:rFonts w:ascii="Liberation Serif" w:hAnsi="Liberation Serif" w:eastAsia="DejaVu Sans" w:cs="Noto Sans Arabic UI"/>
+          <w:sz w:val="24"/>
+          <w:szCs w:val="24"/>
+          <w:lang w:val="en-US" w:eastAsia="en-US" w:bidi="en-US"/>
+        </w:rPr>
+      </w:r>
+    </w:p>
+  </w:comment>
+  <w:comment w:id="5" w:author="Unbekannter Autor" w:date="2026-07-08T13:31:06Z" w:initials="">
+    <w:p>
+      <w:r>
+        <w:rPr>
+          <w:rFonts w:ascii="Calibri" w:hAnsi="Calibri" w:eastAsia="Calibri" w:cs=""/>
+          <w:b w:val="false"/>
+          <w:bCs w:val="false"/>
+          <w:i w:val="false"/>
+          <w:iCs w:val="false"/>
+          <w:caps w:val="false"/>
+          <w:smallCaps w:val="false"/>
+          <w:strike w:val="false"/>
+          <w:dstrike w:val="false"/>
+          <w:outline w:val="false"/>
+          <w:shadow w:val="false"/>
+          <w:emboss w:val="false"/>
+          <w:imprint w:val="false"/>
+          <w:color w:val="auto"/>
+          <w:spacing w:val="0"/>
+          <w:w w:val="100"/>
+          <w:kern w:val="0"/>
+          <w:position w:val="0"/>
+          <w:sz w:val="20"/>
+          <w:sz w:val="20"/>
+          <w:szCs w:val="22"/>
+          <w:u w:val="none"/>
+          <w:vertAlign w:val="baseline"/>
+          <w:em w:val="none"/>
+          <w:lang w:val="de-DE" w:eastAsia="en-US" w:bidi="ar-SA"/>
+        </w:rPr>
         <w:t>Ich werde niemals Daten veröffentlichen. Muss ich diesen Absatz trotzdem erwähnen?</w:t>
       </w:r>
     </w:p>
   </w:comment>
-  <w:comment w:id="4" w:author="Unbekannter Autor" w:date="2026-07-08T13:35:03Z" w:initials="">
+  <w:comment w:id="6" w:author="Unbekannter Autor" w:date="2026-07-08T13:35:03Z" w:initials="">
+    <w:p>
+      <w:r>
+        <w:rPr>
+          <w:rFonts w:ascii="Calibri" w:hAnsi="Calibri" w:eastAsia="Calibri" w:cs=""/>
+          <w:b w:val="false"/>
+          <w:bCs w:val="false"/>
+          <w:i w:val="false"/>
+          <w:iCs w:val="false"/>
+          <w:caps w:val="false"/>
+          <w:smallCaps w:val="false"/>
+          <w:strike w:val="false"/>
+          <w:dstrike w:val="false"/>
+          <w:outline w:val="false"/>
+          <w:shadow w:val="false"/>
+          <w:emboss w:val="false"/>
+          <w:imprint w:val="false"/>
+          <w:color w:val="auto"/>
+          <w:spacing w:val="0"/>
+          <w:w w:val="100"/>
+          <w:kern w:val="0"/>
+          <w:position w:val="0"/>
+          <w:sz w:val="20"/>
+          <w:sz w:val="20"/>
+          <w:szCs w:val="22"/>
+          <w:u w:val="none"/>
+          <w:vertAlign w:val="baseline"/>
+          <w:em w:val="none"/>
+          <w:lang w:val="de-DE" w:eastAsia="en-US" w:bidi="ar-SA"/>
+        </w:rPr>
+        <w:t>Was bedeutet Datenübertragbarkeit?</w:t>
+      </w:r>
+    </w:p>
+  </w:comment>
+  <w:comment w:id="7" w:author="Unbekannter Autor" w:date="2026-07-08T13:35:24Z" w:initials="">
+    <w:p>
+      <w:r>
+        <w:rPr>
+          <w:rFonts w:ascii="Calibri" w:hAnsi="Calibri" w:eastAsia="Calibri" w:cs=""/>
+          <w:b w:val="false"/>
+          <w:bCs w:val="false"/>
+          <w:i w:val="false"/>
+          <w:iCs w:val="false"/>
+          <w:caps w:val="false"/>
+          <w:smallCaps w:val="false"/>
+          <w:strike w:val="false"/>
+          <w:dstrike w:val="false"/>
+          <w:outline w:val="false"/>
+          <w:shadow w:val="false"/>
+          <w:emboss w:val="false"/>
+          <w:imprint w:val="false"/>
+          <w:color w:val="auto"/>
+          <w:spacing w:val="0"/>
+          <w:w w:val="100"/>
+          <w:kern w:val="0"/>
+          <w:position w:val="0"/>
+          <w:sz w:val="20"/>
+          <w:sz w:val="20"/>
+          <w:szCs w:val="22"/>
+          <w:u w:val="none"/>
+          <w:vertAlign w:val="baseline"/>
+          <w:em w:val="none"/>
+          <w:lang w:val="de-DE" w:eastAsia="en-US" w:bidi="ar-SA"/>
+        </w:rPr>
+        <w:t>Rechnungen mit Adressen müssen für das FInanzamt gespeichert werden. Kann jemand dieser Speicherung widersprechen?</w:t>
+      </w:r>
+    </w:p>
+    <w:p>
+      <w:r>
+        <w:rPr>
+          <w:rFonts w:ascii="Liberation Serif" w:hAnsi="Liberation Serif" w:eastAsia="DejaVu Sans" w:cs="Noto Sans Arabic UI"/>
+          <w:sz w:val="24"/>
+          <w:szCs w:val="24"/>
+          <w:lang w:val="en-US" w:eastAsia="en-US" w:bidi="en-US"/>
+        </w:rPr>
+      </w:r>
+    </w:p>
+  </w:comment>
+  <w:comment w:id="8" w:author="Unbekannter Autor" w:date="2026-07-08T13:37:16Z" w:initials="">
+    <w:p>
+      <w:r>
+        <w:rPr>
+          <w:rFonts w:ascii="Calibri" w:hAnsi="Calibri" w:eastAsia="Calibri" w:cs=""/>
+          <w:b w:val="false"/>
+          <w:bCs w:val="false"/>
+          <w:i w:val="false"/>
+          <w:iCs w:val="false"/>
+          <w:caps w:val="false"/>
+          <w:smallCaps w:val="false"/>
+          <w:strike w:val="false"/>
+          <w:dstrike w:val="false"/>
+          <w:outline w:val="false"/>
+          <w:shadow w:val="false"/>
+          <w:emboss w:val="false"/>
+          <w:imprint w:val="false"/>
+          <w:color w:val="auto"/>
+          <w:spacing w:val="0"/>
+          <w:w w:val="100"/>
+          <w:kern w:val="0"/>
+          <w:position w:val="0"/>
+          <w:sz w:val="20"/>
+          <w:sz w:val="20"/>
+          <w:szCs w:val="22"/>
+          <w:u w:val="none"/>
+          <w:vertAlign w:val="baseline"/>
+          <w:em w:val="none"/>
+          <w:lang w:val="de-DE" w:eastAsia="en-US" w:bidi="ar-SA"/>
+        </w:rPr>
+        <w:t>Ich werde niemals Direktwerbung machen, kann ich den Absatz dann löschen?</w:t>
+      </w:r>
+    </w:p>
+  </w:comment>
+  <w:comment w:id="9" w:author="Unbekannter Autor" w:date="2026-07-08T13:37:59Z" w:initials="">
+    <w:p>
+      <w:r>
+        <w:rPr>
+          <w:rFonts w:ascii="Calibri" w:hAnsi="Calibri" w:eastAsia="Calibri" w:cs=""/>
+          <w:b w:val="false"/>
+          <w:bCs w:val="false"/>
+          <w:i w:val="false"/>
+          <w:iCs w:val="false"/>
+          <w:caps w:val="false"/>
+          <w:smallCaps w:val="false"/>
+          <w:strike w:val="false"/>
+          <w:dstrike w:val="false"/>
+          <w:outline w:val="false"/>
+          <w:shadow w:val="false"/>
+          <w:emboss w:val="false"/>
+          <w:imprint w:val="false"/>
+          <w:color w:val="auto"/>
+          <w:spacing w:val="0"/>
+          <w:w w:val="100"/>
+          <w:kern w:val="0"/>
+          <w:position w:val="0"/>
+          <w:sz w:val="20"/>
+          <w:sz w:val="20"/>
+          <w:szCs w:val="22"/>
+          <w:u w:val="none"/>
+          <w:vertAlign w:val="baseline"/>
+          <w:em w:val="none"/>
+          <w:lang w:val="de-DE" w:eastAsia="en-US" w:bidi="ar-SA"/>
+        </w:rPr>
+        <w:t>Statistische Daten werden auf der Webseite niemals erhoben. Kann der Absatz gelöscht werden?</w:t>
+      </w:r>
+    </w:p>
+    <w:p>
+      <w:r>
+        <w:rPr>
+          <w:rFonts w:ascii="Calibri" w:hAnsi="Calibri" w:eastAsia="Calibri" w:cs=""/>
+          <w:b w:val="false"/>
+          <w:bCs w:val="false"/>
+          <w:i w:val="false"/>
+          <w:iCs w:val="false"/>
+          <w:caps w:val="false"/>
+          <w:smallCaps w:val="false"/>
+          <w:strike w:val="false"/>
+          <w:dstrike w:val="false"/>
+          <w:outline w:val="false"/>
+          <w:shadow w:val="false"/>
+          <w:emboss w:val="false"/>
+          <w:imprint w:val="false"/>
+          <w:color w:val="auto"/>
+          <w:spacing w:val="0"/>
+          <w:w w:val="100"/>
+          <w:kern w:val="0"/>
+          <w:position w:val="0"/>
+          <w:sz w:val="20"/>
+          <w:sz w:val="20"/>
+          <w:szCs w:val="22"/>
+          <w:u w:val="none"/>
+          <w:vertAlign w:val="baseline"/>
+          <w:em w:val="none"/>
+          <w:lang w:val="de-DE" w:eastAsia="en-US" w:bidi="ar-SA"/>
+        </w:rPr>
+        <w:t>Wie ist das mit der Statistik bei Instagram und facebook?</w:t>
+      </w:r>
+    </w:p>
+  </w:comment>
+  <w:comment w:id="10" w:author="Unbekannter Autor" w:date="2026-07-08T13:40:31Z" w:initials="">
+    <w:p>
+      <w:r>
+        <w:rPr>
+          <w:rFonts w:ascii="Calibri" w:hAnsi="Calibri" w:eastAsia="Calibri" w:cs=""/>
+          <w:b w:val="false"/>
+          <w:bCs w:val="false"/>
+          <w:i w:val="false"/>
+          <w:iCs w:val="false"/>
+          <w:caps w:val="false"/>
+          <w:smallCaps w:val="false"/>
+          <w:strike w:val="false"/>
+          <w:dstrike w:val="false"/>
+          <w:outline w:val="false"/>
+          <w:shadow w:val="false"/>
+          <w:emboss w:val="false"/>
+          <w:imprint w:val="false"/>
+          <w:color w:val="auto"/>
+          <w:spacing w:val="0"/>
+          <w:w w:val="100"/>
+          <w:kern w:val="0"/>
+          <w:position w:val="0"/>
+          <w:sz w:val="20"/>
+          <w:sz w:val="20"/>
+          <w:szCs w:val="22"/>
+          <w:u w:val="none"/>
+          <w:vertAlign w:val="baseline"/>
+          <w:em w:val="none"/>
+          <w:lang w:val="de-DE" w:eastAsia="en-US" w:bidi="ar-SA"/>
+        </w:rPr>
+        <w:t>Was ist das?</w:t>
+      </w:r>
+    </w:p>
+  </w:comment>
+  <w:comment w:id="11" w:author="Unbekannter Autor" w:date="2026-07-09T13:04:28Z" w:initials="">
     <w:p>
       <w:r>
         <w:rPr>
@@ -2083,11 +2323,11 @@
           <w:em w:val="none"/>
           <w:lang w:bidi="ar-SA" w:eastAsia="en-US" w:val="de-DE"/>
         </w:rPr>
-        <w:t>Was bedeutet Datenübertragbarkeit?</w:t>
+        <w:t>Ist dieser Absatz überhaupt nötig für mich?</w:t>
       </w:r>
     </w:p>
   </w:comment>
-  <w:comment w:id="5" w:author="Unbekannter Autor" w:date="2026-07-08T13:35:24Z" w:initials="">
+  <w:comment w:id="12" w:author="Unbekannter Autor" w:date="2026-07-09T13:03:49Z" w:initials="">
     <w:p>
       <w:r>
         <w:rPr>
@@ -2116,21 +2356,11 @@
           <w:em w:val="none"/>
           <w:lang w:bidi="ar-SA" w:eastAsia="en-US" w:val="de-DE"/>
         </w:rPr>
-        <w:t>Rechnungen mit Adressen müssen für das FInanzamt gespeichert werden. Kann jemand dieser Speicherung widersprechen?</w:t>
-      </w:r>
-    </w:p>
-    <w:p>
-      <w:r>
-        <w:rPr>
-          <w:rFonts w:ascii="Liberation Serif" w:hAnsi="Liberation Serif" w:eastAsia="DejaVu Sans" w:cs="Noto Sans Arabic UI"/>
-          <w:sz w:val="24"/>
-          <w:szCs w:val="24"/>
-          <w:lang w:val="en-US" w:eastAsia="en-US" w:bidi="en-US"/>
-        </w:rPr>
+        <w:t>Muss ich die Einwilligung eplizit einholen oder gilt sie als eingeholt, wenn mich jemand kontaktiert?</w:t>
       </w:r>
     </w:p>
   </w:comment>
-  <w:comment w:id="6" w:author="Unbekannter Autor" w:date="2026-07-08T13:37:16Z" w:initials="">
+  <w:comment w:id="13" w:author="Unbekannter Autor" w:date="2026-07-09T13:05:47Z" w:initials="">
     <w:p>
       <w:r>
         <w:rPr>
@@ -2159,11 +2389,11 @@
           <w:em w:val="none"/>
           <w:lang w:bidi="ar-SA" w:eastAsia="en-US" w:val="de-DE"/>
         </w:rPr>
-        <w:t>Ich werde niemals Direktwerbung machen, kann ich den Absatz dann löschen?</w:t>
+        <w:t>Absatz relevant für mich? Ich habe keine MItarbeiter???</w:t>
       </w:r>
     </w:p>
   </w:comment>
-  <w:comment w:id="7" w:author="Unbekannter Autor" w:date="2026-07-08T13:37:59Z" w:initials="">
+  <w:comment w:id="14" w:author="Unbekannter Autor" w:date="2026-07-09T13:12:14Z" w:initials="">
     <w:p>
       <w:r>
         <w:rPr>
@@ -2192,43 +2422,11 @@
           <w:em w:val="none"/>
           <w:lang w:bidi="ar-SA" w:eastAsia="en-US" w:val="de-DE"/>
         </w:rPr>
-        <w:t>Statistische Daten werden auf der Webseite niemals erhoben. Kann der Absatz gelöscht werden?</w:t>
-      </w:r>
-    </w:p>
-    <w:p>
-      <w:r>
-        <w:rPr>
-          <w:rFonts w:ascii="Calibri" w:hAnsi="Calibri" w:eastAsia="Calibri" w:cs="" w:asciiTheme="minorHAnsi" w:cstheme="minorBidi" w:eastAsiaTheme="minorHAnsi" w:hAnsiTheme="minorHAnsi"/>
-          <w:b w:val="false"/>
-          <w:bCs w:val="false"/>
-          <w:i w:val="false"/>
-          <w:iCs w:val="false"/>
-          <w:caps w:val="false"/>
-          <w:smallCaps w:val="false"/>
-          <w:strike w:val="false"/>
-          <w:dstrike w:val="false"/>
-          <w:outline w:val="false"/>
-          <w:shadow w:val="false"/>
-          <w:emboss w:val="false"/>
-          <w:imprint w:val="false"/>
-          <w:color w:val="auto"/>
-          <w:spacing w:val="0"/>
-          <w:w w:val="100"/>
-          <w:kern w:val="0"/>
-          <w:position w:val="0"/>
-          <w:sz w:val="20"/>
-          <w:sz w:val="20"/>
-          <w:szCs w:val="22"/>
-          <w:u w:val="none"/>
-          <w:vertAlign w:val="baseline"/>
-          <w:em w:val="none"/>
-          <w:lang w:val="de-DE" w:eastAsia="en-US" w:bidi="ar-SA"/>
-        </w:rPr>
-        <w:t>Wie ist das mit der Statistik bei Instagram und facebook?</w:t>
+        <w:t>Kann ich auch festlegen, dass es keine einzelfallbezogene Entscheidung gibt, sondern grundlegend festgelegt ist, dass ohne Bereitstellung der Daten kein Vertragsabschluss möglich ist?</w:t>
       </w:r>
     </w:p>
   </w:comment>
-  <w:comment w:id="8" w:author="Unbekannter Autor" w:date="2026-07-08T13:40:31Z" w:initials="">
+  <w:comment w:id="15" w:author="Unbekannter Autor" w:date="2026-07-09T13:14:27Z" w:initials="">
     <w:p>
       <w:r>
         <w:rPr>
@@ -2257,7 +2455,17 @@
           <w:em w:val="none"/>
           <w:lang w:bidi="ar-SA" w:eastAsia="en-US" w:val="de-DE"/>
         </w:rPr>
-        <w:t>Was ist das?</w:t>
+        <w:t>Wenn es nicht stattfindet, muss man es dann überhaupt erwähnen?</w:t>
+      </w:r>
+    </w:p>
+    <w:p>
+      <w:r>
+        <w:rPr>
+          <w:rFonts w:ascii="Liberation Serif" w:hAnsi="Liberation Serif" w:eastAsia="DejaVu Sans" w:cs="Noto Sans Arabic UI"/>
+          <w:sz w:val="24"/>
+          <w:szCs w:val="24"/>
+          <w:lang w:val="en-US" w:eastAsia="en-US" w:bidi="en-US"/>
+        </w:rPr>
       </w:r>
     </w:p>
   </w:comment>

</xml_diff>